<commit_message>
fix(cfo): folhas de plantao com o efetivo completo (mapa de equipes)
As 8 folhas de alteracao do plantao estavam so com os alunos da
Turma 13 de cada grupo. Agora usam o efetivo COMPLETO de cada equipe
(MilitarPlantao, 197 militares da 2a CIA): GOLF 25, HOTEL 26, INDIA 24,
JULIETT 25, KILO 25, LIMA 23, MIKE 24, NOVEMBER 25.

Co-Authored-By: Claude Fable 5 <noreply@anthropic.com>
</commit_message>
<xml_diff>
--- a/public/modelos/folha-alteracoes-plantao-golf.docx
+++ b/public/modelos/folha-alteracoes-plantao-golf.docx
@@ -251,6 +251,162 @@
                 <w:rFonts w:ascii="Arial" w:hAnsi="Arial"/>
                 <w:sz w:val="18"/>
               </w:rPr>
+              <w:t xml:space="preserve">1</w:t>
+            </w:r>
+          </w:p>
+        </w:tc>
+        <w:tc>
+          <w:tcPr>
+            <w:tcW w:w="1700" w:type="dxa"/>
+            <w:vAlign w:val="center"/>
+          </w:tcPr>
+          <w:p>
+            <w:pPr>
+              <w:jc w:val="center"/>
+              <w:spacing w:after="20" w:before="20" w:line="240" w:lineRule="auto"/>
+            </w:pPr>
+            <w:r>
+              <w:rPr>
+                <w:rFonts w:ascii="Arial" w:hAnsi="Arial"/>
+                <w:sz w:val="18"/>
+              </w:rPr>
+              <w:t xml:space="preserve">AL CFO PM</w:t>
+            </w:r>
+          </w:p>
+        </w:tc>
+        <w:tc>
+          <w:tcPr>
+            <w:tcW w:w="4500" w:type="dxa"/>
+            <w:vAlign w:val="center"/>
+          </w:tcPr>
+          <w:p>
+            <w:pPr>
+              <w:jc w:val="left"/>
+              <w:spacing w:after="20" w:before="20" w:line="240" w:lineRule="auto"/>
+            </w:pPr>
+            <w:r>
+              <w:rPr>
+                <w:rFonts w:ascii="Arial" w:hAnsi="Arial"/>
+                <w:sz w:val="18"/>
+              </w:rPr>
+              <w:t xml:space="preserve">HELLTON FERNANDES</w:t>
+            </w:r>
+          </w:p>
+        </w:tc>
+        <w:tc>
+          <w:tcPr>
+            <w:tcW w:w="2500" w:type="dxa"/>
+            <w:vAlign w:val="center"/>
+          </w:tcPr>
+          <w:p>
+            <w:pPr>
+              <w:jc w:val="left"/>
+              <w:spacing w:after="20" w:before="20" w:line="240" w:lineRule="auto"/>
+            </w:pPr>
+            <w:r>
+              <w:rPr>
+                <w:rFonts w:ascii="Arial" w:hAnsi="Arial"/>
+                <w:sz w:val="18"/>
+              </w:rPr>
+              <w:t xml:space="preserve"/>
+            </w:r>
+          </w:p>
+        </w:tc>
+      </w:tr>
+      <w:tr>
+        <w:tc>
+          <w:tcPr>
+            <w:tcW w:w="900" w:type="dxa"/>
+            <w:vAlign w:val="center"/>
+          </w:tcPr>
+          <w:p>
+            <w:pPr>
+              <w:jc w:val="center"/>
+              <w:spacing w:after="20" w:before="20" w:line="240" w:lineRule="auto"/>
+            </w:pPr>
+            <w:r>
+              <w:rPr>
+                <w:rFonts w:ascii="Arial" w:hAnsi="Arial"/>
+                <w:sz w:val="18"/>
+              </w:rPr>
+              <w:t xml:space="preserve">6</w:t>
+            </w:r>
+          </w:p>
+        </w:tc>
+        <w:tc>
+          <w:tcPr>
+            <w:tcW w:w="1700" w:type="dxa"/>
+            <w:vAlign w:val="center"/>
+          </w:tcPr>
+          <w:p>
+            <w:pPr>
+              <w:jc w:val="center"/>
+              <w:spacing w:after="20" w:before="20" w:line="240" w:lineRule="auto"/>
+            </w:pPr>
+            <w:r>
+              <w:rPr>
+                <w:rFonts w:ascii="Arial" w:hAnsi="Arial"/>
+                <w:sz w:val="18"/>
+              </w:rPr>
+              <w:t xml:space="preserve">AL CFO PM</w:t>
+            </w:r>
+          </w:p>
+        </w:tc>
+        <w:tc>
+          <w:tcPr>
+            <w:tcW w:w="4500" w:type="dxa"/>
+            <w:vAlign w:val="center"/>
+          </w:tcPr>
+          <w:p>
+            <w:pPr>
+              <w:jc w:val="left"/>
+              <w:spacing w:after="20" w:before="20" w:line="240" w:lineRule="auto"/>
+            </w:pPr>
+            <w:r>
+              <w:rPr>
+                <w:rFonts w:ascii="Arial" w:hAnsi="Arial"/>
+                <w:sz w:val="18"/>
+              </w:rPr>
+              <w:t xml:space="preserve">CAMPOS</w:t>
+            </w:r>
+          </w:p>
+        </w:tc>
+        <w:tc>
+          <w:tcPr>
+            <w:tcW w:w="2500" w:type="dxa"/>
+            <w:vAlign w:val="center"/>
+          </w:tcPr>
+          <w:p>
+            <w:pPr>
+              <w:jc w:val="left"/>
+              <w:spacing w:after="20" w:before="20" w:line="240" w:lineRule="auto"/>
+            </w:pPr>
+            <w:r>
+              <w:rPr>
+                <w:rFonts w:ascii="Arial" w:hAnsi="Arial"/>
+                <w:sz w:val="18"/>
+              </w:rPr>
+              <w:t xml:space="preserve"/>
+            </w:r>
+          </w:p>
+        </w:tc>
+      </w:tr>
+      <w:tr>
+        <w:tc>
+          <w:tcPr>
+            <w:tcW w:w="900" w:type="dxa"/>
+            <w:vAlign w:val="center"/>
+          </w:tcPr>
+          <w:p>
+            <w:pPr>
+              <w:jc w:val="center"/>
+              <w:spacing w:after="20" w:before="20" w:line="240" w:lineRule="auto"/>
+            </w:pPr>
+            <w:r>
+              <w:rPr>
+                <w:rFonts w:ascii="Arial" w:hAnsi="Arial"/>
+                <w:sz w:val="18"/>
+              </w:rPr>
               <w:t xml:space="preserve">7</w:t>
             </w:r>
           </w:p>
@@ -329,6 +485,240 @@
                 <w:rFonts w:ascii="Arial" w:hAnsi="Arial"/>
                 <w:sz w:val="18"/>
               </w:rPr>
+              <w:t xml:space="preserve">8</w:t>
+            </w:r>
+          </w:p>
+        </w:tc>
+        <w:tc>
+          <w:tcPr>
+            <w:tcW w:w="1700" w:type="dxa"/>
+            <w:vAlign w:val="center"/>
+          </w:tcPr>
+          <w:p>
+            <w:pPr>
+              <w:jc w:val="center"/>
+              <w:spacing w:after="20" w:before="20" w:line="240" w:lineRule="auto"/>
+            </w:pPr>
+            <w:r>
+              <w:rPr>
+                <w:rFonts w:ascii="Arial" w:hAnsi="Arial"/>
+                <w:sz w:val="18"/>
+              </w:rPr>
+              <w:t xml:space="preserve">AL CFO PM</w:t>
+            </w:r>
+          </w:p>
+        </w:tc>
+        <w:tc>
+          <w:tcPr>
+            <w:tcW w:w="4500" w:type="dxa"/>
+            <w:vAlign w:val="center"/>
+          </w:tcPr>
+          <w:p>
+            <w:pPr>
+              <w:jc w:val="left"/>
+              <w:spacing w:after="20" w:before="20" w:line="240" w:lineRule="auto"/>
+            </w:pPr>
+            <w:r>
+              <w:rPr>
+                <w:rFonts w:ascii="Arial" w:hAnsi="Arial"/>
+                <w:sz w:val="18"/>
+              </w:rPr>
+              <w:t xml:space="preserve">JEFFERSON FRANCISCO</w:t>
+            </w:r>
+          </w:p>
+        </w:tc>
+        <w:tc>
+          <w:tcPr>
+            <w:tcW w:w="2500" w:type="dxa"/>
+            <w:vAlign w:val="center"/>
+          </w:tcPr>
+          <w:p>
+            <w:pPr>
+              <w:jc w:val="left"/>
+              <w:spacing w:after="20" w:before="20" w:line="240" w:lineRule="auto"/>
+            </w:pPr>
+            <w:r>
+              <w:rPr>
+                <w:rFonts w:ascii="Arial" w:hAnsi="Arial"/>
+                <w:sz w:val="18"/>
+              </w:rPr>
+              <w:t xml:space="preserve"/>
+            </w:r>
+          </w:p>
+        </w:tc>
+      </w:tr>
+      <w:tr>
+        <w:tc>
+          <w:tcPr>
+            <w:tcW w:w="900" w:type="dxa"/>
+            <w:vAlign w:val="center"/>
+          </w:tcPr>
+          <w:p>
+            <w:pPr>
+              <w:jc w:val="center"/>
+              <w:spacing w:after="20" w:before="20" w:line="240" w:lineRule="auto"/>
+            </w:pPr>
+            <w:r>
+              <w:rPr>
+                <w:rFonts w:ascii="Arial" w:hAnsi="Arial"/>
+                <w:sz w:val="18"/>
+              </w:rPr>
+              <w:t xml:space="preserve">15</w:t>
+            </w:r>
+          </w:p>
+        </w:tc>
+        <w:tc>
+          <w:tcPr>
+            <w:tcW w:w="1700" w:type="dxa"/>
+            <w:vAlign w:val="center"/>
+          </w:tcPr>
+          <w:p>
+            <w:pPr>
+              <w:jc w:val="center"/>
+              <w:spacing w:after="20" w:before="20" w:line="240" w:lineRule="auto"/>
+            </w:pPr>
+            <w:r>
+              <w:rPr>
+                <w:rFonts w:ascii="Arial" w:hAnsi="Arial"/>
+                <w:sz w:val="18"/>
+              </w:rPr>
+              <w:t xml:space="preserve">AL CFO PM</w:t>
+            </w:r>
+          </w:p>
+        </w:tc>
+        <w:tc>
+          <w:tcPr>
+            <w:tcW w:w="4500" w:type="dxa"/>
+            <w:vAlign w:val="center"/>
+          </w:tcPr>
+          <w:p>
+            <w:pPr>
+              <w:jc w:val="left"/>
+              <w:spacing w:after="20" w:before="20" w:line="240" w:lineRule="auto"/>
+            </w:pPr>
+            <w:r>
+              <w:rPr>
+                <w:rFonts w:ascii="Arial" w:hAnsi="Arial"/>
+                <w:sz w:val="18"/>
+              </w:rPr>
+              <w:t xml:space="preserve">TAYNÃ RAMALHO</w:t>
+            </w:r>
+          </w:p>
+        </w:tc>
+        <w:tc>
+          <w:tcPr>
+            <w:tcW w:w="2500" w:type="dxa"/>
+            <w:vAlign w:val="center"/>
+          </w:tcPr>
+          <w:p>
+            <w:pPr>
+              <w:jc w:val="left"/>
+              <w:spacing w:after="20" w:before="20" w:line="240" w:lineRule="auto"/>
+            </w:pPr>
+            <w:r>
+              <w:rPr>
+                <w:rFonts w:ascii="Arial" w:hAnsi="Arial"/>
+                <w:sz w:val="18"/>
+              </w:rPr>
+              <w:t xml:space="preserve"/>
+            </w:r>
+          </w:p>
+        </w:tc>
+      </w:tr>
+      <w:tr>
+        <w:tc>
+          <w:tcPr>
+            <w:tcW w:w="900" w:type="dxa"/>
+            <w:vAlign w:val="center"/>
+          </w:tcPr>
+          <w:p>
+            <w:pPr>
+              <w:jc w:val="center"/>
+              <w:spacing w:after="20" w:before="20" w:line="240" w:lineRule="auto"/>
+            </w:pPr>
+            <w:r>
+              <w:rPr>
+                <w:rFonts w:ascii="Arial" w:hAnsi="Arial"/>
+                <w:sz w:val="18"/>
+              </w:rPr>
+              <w:t xml:space="preserve">16</w:t>
+            </w:r>
+          </w:p>
+        </w:tc>
+        <w:tc>
+          <w:tcPr>
+            <w:tcW w:w="1700" w:type="dxa"/>
+            <w:vAlign w:val="center"/>
+          </w:tcPr>
+          <w:p>
+            <w:pPr>
+              <w:jc w:val="center"/>
+              <w:spacing w:after="20" w:before="20" w:line="240" w:lineRule="auto"/>
+            </w:pPr>
+            <w:r>
+              <w:rPr>
+                <w:rFonts w:ascii="Arial" w:hAnsi="Arial"/>
+                <w:sz w:val="18"/>
+              </w:rPr>
+              <w:t xml:space="preserve">AL CFO PM</w:t>
+            </w:r>
+          </w:p>
+        </w:tc>
+        <w:tc>
+          <w:tcPr>
+            <w:tcW w:w="4500" w:type="dxa"/>
+            <w:vAlign w:val="center"/>
+          </w:tcPr>
+          <w:p>
+            <w:pPr>
+              <w:jc w:val="left"/>
+              <w:spacing w:after="20" w:before="20" w:line="240" w:lineRule="auto"/>
+            </w:pPr>
+            <w:r>
+              <w:rPr>
+                <w:rFonts w:ascii="Arial" w:hAnsi="Arial"/>
+                <w:sz w:val="18"/>
+              </w:rPr>
+              <w:t xml:space="preserve">FLÁVIO CARVALHO</w:t>
+            </w:r>
+          </w:p>
+        </w:tc>
+        <w:tc>
+          <w:tcPr>
+            <w:tcW w:w="2500" w:type="dxa"/>
+            <w:vAlign w:val="center"/>
+          </w:tcPr>
+          <w:p>
+            <w:pPr>
+              <w:jc w:val="left"/>
+              <w:spacing w:after="20" w:before="20" w:line="240" w:lineRule="auto"/>
+            </w:pPr>
+            <w:r>
+              <w:rPr>
+                <w:rFonts w:ascii="Arial" w:hAnsi="Arial"/>
+                <w:sz w:val="18"/>
+              </w:rPr>
+              <w:t xml:space="preserve"/>
+            </w:r>
+          </w:p>
+        </w:tc>
+      </w:tr>
+      <w:tr>
+        <w:tc>
+          <w:tcPr>
+            <w:tcW w:w="900" w:type="dxa"/>
+            <w:vAlign w:val="center"/>
+          </w:tcPr>
+          <w:p>
+            <w:pPr>
+              <w:jc w:val="center"/>
+              <w:spacing w:after="20" w:before="20" w:line="240" w:lineRule="auto"/>
+            </w:pPr>
+            <w:r>
+              <w:rPr>
+                <w:rFonts w:ascii="Arial" w:hAnsi="Arial"/>
+                <w:sz w:val="18"/>
+              </w:rPr>
               <w:t xml:space="preserve">19</w:t>
             </w:r>
           </w:p>
@@ -407,6 +797,552 @@
                 <w:rFonts w:ascii="Arial" w:hAnsi="Arial"/>
                 <w:sz w:val="18"/>
               </w:rPr>
+              <w:t xml:space="preserve">27</w:t>
+            </w:r>
+          </w:p>
+        </w:tc>
+        <w:tc>
+          <w:tcPr>
+            <w:tcW w:w="1700" w:type="dxa"/>
+            <w:vAlign w:val="center"/>
+          </w:tcPr>
+          <w:p>
+            <w:pPr>
+              <w:jc w:val="center"/>
+              <w:spacing w:after="20" w:before="20" w:line="240" w:lineRule="auto"/>
+            </w:pPr>
+            <w:r>
+              <w:rPr>
+                <w:rFonts w:ascii="Arial" w:hAnsi="Arial"/>
+                <w:sz w:val="18"/>
+              </w:rPr>
+              <w:t xml:space="preserve">AL CFO PM</w:t>
+            </w:r>
+          </w:p>
+        </w:tc>
+        <w:tc>
+          <w:tcPr>
+            <w:tcW w:w="4500" w:type="dxa"/>
+            <w:vAlign w:val="center"/>
+          </w:tcPr>
+          <w:p>
+            <w:pPr>
+              <w:jc w:val="left"/>
+              <w:spacing w:after="20" w:before="20" w:line="240" w:lineRule="auto"/>
+            </w:pPr>
+            <w:r>
+              <w:rPr>
+                <w:rFonts w:ascii="Arial" w:hAnsi="Arial"/>
+                <w:sz w:val="18"/>
+              </w:rPr>
+              <w:t xml:space="preserve">CLÁUDIA</w:t>
+            </w:r>
+          </w:p>
+        </w:tc>
+        <w:tc>
+          <w:tcPr>
+            <w:tcW w:w="2500" w:type="dxa"/>
+            <w:vAlign w:val="center"/>
+          </w:tcPr>
+          <w:p>
+            <w:pPr>
+              <w:jc w:val="left"/>
+              <w:spacing w:after="20" w:before="20" w:line="240" w:lineRule="auto"/>
+            </w:pPr>
+            <w:r>
+              <w:rPr>
+                <w:rFonts w:ascii="Arial" w:hAnsi="Arial"/>
+                <w:sz w:val="18"/>
+              </w:rPr>
+              <w:t xml:space="preserve"/>
+            </w:r>
+          </w:p>
+        </w:tc>
+      </w:tr>
+      <w:tr>
+        <w:tc>
+          <w:tcPr>
+            <w:tcW w:w="900" w:type="dxa"/>
+            <w:vAlign w:val="center"/>
+          </w:tcPr>
+          <w:p>
+            <w:pPr>
+              <w:jc w:val="center"/>
+              <w:spacing w:after="20" w:before="20" w:line="240" w:lineRule="auto"/>
+            </w:pPr>
+            <w:r>
+              <w:rPr>
+                <w:rFonts w:ascii="Arial" w:hAnsi="Arial"/>
+                <w:sz w:val="18"/>
+              </w:rPr>
+              <w:t xml:space="preserve">32</w:t>
+            </w:r>
+          </w:p>
+        </w:tc>
+        <w:tc>
+          <w:tcPr>
+            <w:tcW w:w="1700" w:type="dxa"/>
+            <w:vAlign w:val="center"/>
+          </w:tcPr>
+          <w:p>
+            <w:pPr>
+              <w:jc w:val="center"/>
+              <w:spacing w:after="20" w:before="20" w:line="240" w:lineRule="auto"/>
+            </w:pPr>
+            <w:r>
+              <w:rPr>
+                <w:rFonts w:ascii="Arial" w:hAnsi="Arial"/>
+                <w:sz w:val="18"/>
+              </w:rPr>
+              <w:t xml:space="preserve">AL CFO PM</w:t>
+            </w:r>
+          </w:p>
+        </w:tc>
+        <w:tc>
+          <w:tcPr>
+            <w:tcW w:w="4500" w:type="dxa"/>
+            <w:vAlign w:val="center"/>
+          </w:tcPr>
+          <w:p>
+            <w:pPr>
+              <w:jc w:val="left"/>
+              <w:spacing w:after="20" w:before="20" w:line="240" w:lineRule="auto"/>
+            </w:pPr>
+            <w:r>
+              <w:rPr>
+                <w:rFonts w:ascii="Arial" w:hAnsi="Arial"/>
+                <w:sz w:val="18"/>
+              </w:rPr>
+              <w:t xml:space="preserve">NAPOLEÃO</w:t>
+            </w:r>
+          </w:p>
+        </w:tc>
+        <w:tc>
+          <w:tcPr>
+            <w:tcW w:w="2500" w:type="dxa"/>
+            <w:vAlign w:val="center"/>
+          </w:tcPr>
+          <w:p>
+            <w:pPr>
+              <w:jc w:val="left"/>
+              <w:spacing w:after="20" w:before="20" w:line="240" w:lineRule="auto"/>
+            </w:pPr>
+            <w:r>
+              <w:rPr>
+                <w:rFonts w:ascii="Arial" w:hAnsi="Arial"/>
+                <w:sz w:val="18"/>
+              </w:rPr>
+              <w:t xml:space="preserve"/>
+            </w:r>
+          </w:p>
+        </w:tc>
+      </w:tr>
+      <w:tr>
+        <w:tc>
+          <w:tcPr>
+            <w:tcW w:w="900" w:type="dxa"/>
+            <w:vAlign w:val="center"/>
+          </w:tcPr>
+          <w:p>
+            <w:pPr>
+              <w:jc w:val="center"/>
+              <w:spacing w:after="20" w:before="20" w:line="240" w:lineRule="auto"/>
+            </w:pPr>
+            <w:r>
+              <w:rPr>
+                <w:rFonts w:ascii="Arial" w:hAnsi="Arial"/>
+                <w:sz w:val="18"/>
+              </w:rPr>
+              <w:t xml:space="preserve">34</w:t>
+            </w:r>
+          </w:p>
+        </w:tc>
+        <w:tc>
+          <w:tcPr>
+            <w:tcW w:w="1700" w:type="dxa"/>
+            <w:vAlign w:val="center"/>
+          </w:tcPr>
+          <w:p>
+            <w:pPr>
+              <w:jc w:val="center"/>
+              <w:spacing w:after="20" w:before="20" w:line="240" w:lineRule="auto"/>
+            </w:pPr>
+            <w:r>
+              <w:rPr>
+                <w:rFonts w:ascii="Arial" w:hAnsi="Arial"/>
+                <w:sz w:val="18"/>
+              </w:rPr>
+              <w:t xml:space="preserve">AL CFO PM</w:t>
+            </w:r>
+          </w:p>
+        </w:tc>
+        <w:tc>
+          <w:tcPr>
+            <w:tcW w:w="4500" w:type="dxa"/>
+            <w:vAlign w:val="center"/>
+          </w:tcPr>
+          <w:p>
+            <w:pPr>
+              <w:jc w:val="left"/>
+              <w:spacing w:after="20" w:before="20" w:line="240" w:lineRule="auto"/>
+            </w:pPr>
+            <w:r>
+              <w:rPr>
+                <w:rFonts w:ascii="Arial" w:hAnsi="Arial"/>
+                <w:sz w:val="18"/>
+              </w:rPr>
+              <w:t xml:space="preserve">RICARDO</w:t>
+            </w:r>
+          </w:p>
+        </w:tc>
+        <w:tc>
+          <w:tcPr>
+            <w:tcW w:w="2500" w:type="dxa"/>
+            <w:vAlign w:val="center"/>
+          </w:tcPr>
+          <w:p>
+            <w:pPr>
+              <w:jc w:val="left"/>
+              <w:spacing w:after="20" w:before="20" w:line="240" w:lineRule="auto"/>
+            </w:pPr>
+            <w:r>
+              <w:rPr>
+                <w:rFonts w:ascii="Arial" w:hAnsi="Arial"/>
+                <w:sz w:val="18"/>
+              </w:rPr>
+              <w:t xml:space="preserve"/>
+            </w:r>
+          </w:p>
+        </w:tc>
+      </w:tr>
+      <w:tr>
+        <w:tc>
+          <w:tcPr>
+            <w:tcW w:w="900" w:type="dxa"/>
+            <w:vAlign w:val="center"/>
+          </w:tcPr>
+          <w:p>
+            <w:pPr>
+              <w:jc w:val="center"/>
+              <w:spacing w:after="20" w:before="20" w:line="240" w:lineRule="auto"/>
+            </w:pPr>
+            <w:r>
+              <w:rPr>
+                <w:rFonts w:ascii="Arial" w:hAnsi="Arial"/>
+                <w:sz w:val="18"/>
+              </w:rPr>
+              <w:t xml:space="preserve">39</w:t>
+            </w:r>
+          </w:p>
+        </w:tc>
+        <w:tc>
+          <w:tcPr>
+            <w:tcW w:w="1700" w:type="dxa"/>
+            <w:vAlign w:val="center"/>
+          </w:tcPr>
+          <w:p>
+            <w:pPr>
+              <w:jc w:val="center"/>
+              <w:spacing w:after="20" w:before="20" w:line="240" w:lineRule="auto"/>
+            </w:pPr>
+            <w:r>
+              <w:rPr>
+                <w:rFonts w:ascii="Arial" w:hAnsi="Arial"/>
+                <w:sz w:val="18"/>
+              </w:rPr>
+              <w:t xml:space="preserve">AL CFO PM</w:t>
+            </w:r>
+          </w:p>
+        </w:tc>
+        <w:tc>
+          <w:tcPr>
+            <w:tcW w:w="4500" w:type="dxa"/>
+            <w:vAlign w:val="center"/>
+          </w:tcPr>
+          <w:p>
+            <w:pPr>
+              <w:jc w:val="left"/>
+              <w:spacing w:after="20" w:before="20" w:line="240" w:lineRule="auto"/>
+            </w:pPr>
+            <w:r>
+              <w:rPr>
+                <w:rFonts w:ascii="Arial" w:hAnsi="Arial"/>
+                <w:sz w:val="18"/>
+              </w:rPr>
+              <w:t xml:space="preserve">CAETANO</w:t>
+            </w:r>
+          </w:p>
+        </w:tc>
+        <w:tc>
+          <w:tcPr>
+            <w:tcW w:w="2500" w:type="dxa"/>
+            <w:vAlign w:val="center"/>
+          </w:tcPr>
+          <w:p>
+            <w:pPr>
+              <w:jc w:val="left"/>
+              <w:spacing w:after="20" w:before="20" w:line="240" w:lineRule="auto"/>
+            </w:pPr>
+            <w:r>
+              <w:rPr>
+                <w:rFonts w:ascii="Arial" w:hAnsi="Arial"/>
+                <w:sz w:val="18"/>
+              </w:rPr>
+              <w:t xml:space="preserve"/>
+            </w:r>
+          </w:p>
+        </w:tc>
+      </w:tr>
+      <w:tr>
+        <w:tc>
+          <w:tcPr>
+            <w:tcW w:w="900" w:type="dxa"/>
+            <w:vAlign w:val="center"/>
+          </w:tcPr>
+          <w:p>
+            <w:pPr>
+              <w:jc w:val="center"/>
+              <w:spacing w:after="20" w:before="20" w:line="240" w:lineRule="auto"/>
+            </w:pPr>
+            <w:r>
+              <w:rPr>
+                <w:rFonts w:ascii="Arial" w:hAnsi="Arial"/>
+                <w:sz w:val="18"/>
+              </w:rPr>
+              <w:t xml:space="preserve">42</w:t>
+            </w:r>
+          </w:p>
+        </w:tc>
+        <w:tc>
+          <w:tcPr>
+            <w:tcW w:w="1700" w:type="dxa"/>
+            <w:vAlign w:val="center"/>
+          </w:tcPr>
+          <w:p>
+            <w:pPr>
+              <w:jc w:val="center"/>
+              <w:spacing w:after="20" w:before="20" w:line="240" w:lineRule="auto"/>
+            </w:pPr>
+            <w:r>
+              <w:rPr>
+                <w:rFonts w:ascii="Arial" w:hAnsi="Arial"/>
+                <w:sz w:val="18"/>
+              </w:rPr>
+              <w:t xml:space="preserve">AL CFO PM</w:t>
+            </w:r>
+          </w:p>
+        </w:tc>
+        <w:tc>
+          <w:tcPr>
+            <w:tcW w:w="4500" w:type="dxa"/>
+            <w:vAlign w:val="center"/>
+          </w:tcPr>
+          <w:p>
+            <w:pPr>
+              <w:jc w:val="left"/>
+              <w:spacing w:after="20" w:before="20" w:line="240" w:lineRule="auto"/>
+            </w:pPr>
+            <w:r>
+              <w:rPr>
+                <w:rFonts w:ascii="Arial" w:hAnsi="Arial"/>
+                <w:sz w:val="18"/>
+              </w:rPr>
+              <w:t xml:space="preserve">JONILDO</w:t>
+            </w:r>
+          </w:p>
+        </w:tc>
+        <w:tc>
+          <w:tcPr>
+            <w:tcW w:w="2500" w:type="dxa"/>
+            <w:vAlign w:val="center"/>
+          </w:tcPr>
+          <w:p>
+            <w:pPr>
+              <w:jc w:val="left"/>
+              <w:spacing w:after="20" w:before="20" w:line="240" w:lineRule="auto"/>
+            </w:pPr>
+            <w:r>
+              <w:rPr>
+                <w:rFonts w:ascii="Arial" w:hAnsi="Arial"/>
+                <w:sz w:val="18"/>
+              </w:rPr>
+              <w:t xml:space="preserve"/>
+            </w:r>
+          </w:p>
+        </w:tc>
+      </w:tr>
+      <w:tr>
+        <w:tc>
+          <w:tcPr>
+            <w:tcW w:w="900" w:type="dxa"/>
+            <w:vAlign w:val="center"/>
+          </w:tcPr>
+          <w:p>
+            <w:pPr>
+              <w:jc w:val="center"/>
+              <w:spacing w:after="20" w:before="20" w:line="240" w:lineRule="auto"/>
+            </w:pPr>
+            <w:r>
+              <w:rPr>
+                <w:rFonts w:ascii="Arial" w:hAnsi="Arial"/>
+                <w:sz w:val="18"/>
+              </w:rPr>
+              <w:t xml:space="preserve">43</w:t>
+            </w:r>
+          </w:p>
+        </w:tc>
+        <w:tc>
+          <w:tcPr>
+            <w:tcW w:w="1700" w:type="dxa"/>
+            <w:vAlign w:val="center"/>
+          </w:tcPr>
+          <w:p>
+            <w:pPr>
+              <w:jc w:val="center"/>
+              <w:spacing w:after="20" w:before="20" w:line="240" w:lineRule="auto"/>
+            </w:pPr>
+            <w:r>
+              <w:rPr>
+                <w:rFonts w:ascii="Arial" w:hAnsi="Arial"/>
+                <w:sz w:val="18"/>
+              </w:rPr>
+              <w:t xml:space="preserve">AL CFO PM</w:t>
+            </w:r>
+          </w:p>
+        </w:tc>
+        <w:tc>
+          <w:tcPr>
+            <w:tcW w:w="4500" w:type="dxa"/>
+            <w:vAlign w:val="center"/>
+          </w:tcPr>
+          <w:p>
+            <w:pPr>
+              <w:jc w:val="left"/>
+              <w:spacing w:after="20" w:before="20" w:line="240" w:lineRule="auto"/>
+            </w:pPr>
+            <w:r>
+              <w:rPr>
+                <w:rFonts w:ascii="Arial" w:hAnsi="Arial"/>
+                <w:sz w:val="18"/>
+              </w:rPr>
+              <w:t xml:space="preserve">MATHEUS ROCHA</w:t>
+            </w:r>
+          </w:p>
+        </w:tc>
+        <w:tc>
+          <w:tcPr>
+            <w:tcW w:w="2500" w:type="dxa"/>
+            <w:vAlign w:val="center"/>
+          </w:tcPr>
+          <w:p>
+            <w:pPr>
+              <w:jc w:val="left"/>
+              <w:spacing w:after="20" w:before="20" w:line="240" w:lineRule="auto"/>
+            </w:pPr>
+            <w:r>
+              <w:rPr>
+                <w:rFonts w:ascii="Arial" w:hAnsi="Arial"/>
+                <w:sz w:val="18"/>
+              </w:rPr>
+              <w:t xml:space="preserve"/>
+            </w:r>
+          </w:p>
+        </w:tc>
+      </w:tr>
+      <w:tr>
+        <w:tc>
+          <w:tcPr>
+            <w:tcW w:w="900" w:type="dxa"/>
+            <w:vAlign w:val="center"/>
+          </w:tcPr>
+          <w:p>
+            <w:pPr>
+              <w:jc w:val="center"/>
+              <w:spacing w:after="20" w:before="20" w:line="240" w:lineRule="auto"/>
+            </w:pPr>
+            <w:r>
+              <w:rPr>
+                <w:rFonts w:ascii="Arial" w:hAnsi="Arial"/>
+                <w:sz w:val="18"/>
+              </w:rPr>
+              <w:t xml:space="preserve">46</w:t>
+            </w:r>
+          </w:p>
+        </w:tc>
+        <w:tc>
+          <w:tcPr>
+            <w:tcW w:w="1700" w:type="dxa"/>
+            <w:vAlign w:val="center"/>
+          </w:tcPr>
+          <w:p>
+            <w:pPr>
+              <w:jc w:val="center"/>
+              <w:spacing w:after="20" w:before="20" w:line="240" w:lineRule="auto"/>
+            </w:pPr>
+            <w:r>
+              <w:rPr>
+                <w:rFonts w:ascii="Arial" w:hAnsi="Arial"/>
+                <w:sz w:val="18"/>
+              </w:rPr>
+              <w:t xml:space="preserve">AL CFO PM</w:t>
+            </w:r>
+          </w:p>
+        </w:tc>
+        <w:tc>
+          <w:tcPr>
+            <w:tcW w:w="4500" w:type="dxa"/>
+            <w:vAlign w:val="center"/>
+          </w:tcPr>
+          <w:p>
+            <w:pPr>
+              <w:jc w:val="left"/>
+              <w:spacing w:after="20" w:before="20" w:line="240" w:lineRule="auto"/>
+            </w:pPr>
+            <w:r>
+              <w:rPr>
+                <w:rFonts w:ascii="Arial" w:hAnsi="Arial"/>
+                <w:sz w:val="18"/>
+              </w:rPr>
+              <w:t xml:space="preserve">FONTES</w:t>
+            </w:r>
+          </w:p>
+        </w:tc>
+        <w:tc>
+          <w:tcPr>
+            <w:tcW w:w="2500" w:type="dxa"/>
+            <w:vAlign w:val="center"/>
+          </w:tcPr>
+          <w:p>
+            <w:pPr>
+              <w:jc w:val="left"/>
+              <w:spacing w:after="20" w:before="20" w:line="240" w:lineRule="auto"/>
+            </w:pPr>
+            <w:r>
+              <w:rPr>
+                <w:rFonts w:ascii="Arial" w:hAnsi="Arial"/>
+                <w:sz w:val="18"/>
+              </w:rPr>
+              <w:t xml:space="preserve"/>
+            </w:r>
+          </w:p>
+        </w:tc>
+      </w:tr>
+      <w:tr>
+        <w:tc>
+          <w:tcPr>
+            <w:tcW w:w="900" w:type="dxa"/>
+            <w:vAlign w:val="center"/>
+          </w:tcPr>
+          <w:p>
+            <w:pPr>
+              <w:jc w:val="center"/>
+              <w:spacing w:after="20" w:before="20" w:line="240" w:lineRule="auto"/>
+            </w:pPr>
+            <w:r>
+              <w:rPr>
+                <w:rFonts w:ascii="Arial" w:hAnsi="Arial"/>
+                <w:sz w:val="18"/>
+              </w:rPr>
               <w:t xml:space="preserve">57</w:t>
             </w:r>
           </w:p>
@@ -485,6 +1421,240 @@
                 <w:rFonts w:ascii="Arial" w:hAnsi="Arial"/>
                 <w:sz w:val="18"/>
               </w:rPr>
+              <w:t xml:space="preserve">62</w:t>
+            </w:r>
+          </w:p>
+        </w:tc>
+        <w:tc>
+          <w:tcPr>
+            <w:tcW w:w="1700" w:type="dxa"/>
+            <w:vAlign w:val="center"/>
+          </w:tcPr>
+          <w:p>
+            <w:pPr>
+              <w:jc w:val="center"/>
+              <w:spacing w:after="20" w:before="20" w:line="240" w:lineRule="auto"/>
+            </w:pPr>
+            <w:r>
+              <w:rPr>
+                <w:rFonts w:ascii="Arial" w:hAnsi="Arial"/>
+                <w:sz w:val="18"/>
+              </w:rPr>
+              <w:t xml:space="preserve">AL CFO PM</w:t>
+            </w:r>
+          </w:p>
+        </w:tc>
+        <w:tc>
+          <w:tcPr>
+            <w:tcW w:w="4500" w:type="dxa"/>
+            <w:vAlign w:val="center"/>
+          </w:tcPr>
+          <w:p>
+            <w:pPr>
+              <w:jc w:val="left"/>
+              <w:spacing w:after="20" w:before="20" w:line="240" w:lineRule="auto"/>
+            </w:pPr>
+            <w:r>
+              <w:rPr>
+                <w:rFonts w:ascii="Arial" w:hAnsi="Arial"/>
+                <w:sz w:val="18"/>
+              </w:rPr>
+              <w:t xml:space="preserve">IDEYVISON</w:t>
+            </w:r>
+          </w:p>
+        </w:tc>
+        <w:tc>
+          <w:tcPr>
+            <w:tcW w:w="2500" w:type="dxa"/>
+            <w:vAlign w:val="center"/>
+          </w:tcPr>
+          <w:p>
+            <w:pPr>
+              <w:jc w:val="left"/>
+              <w:spacing w:after="20" w:before="20" w:line="240" w:lineRule="auto"/>
+            </w:pPr>
+            <w:r>
+              <w:rPr>
+                <w:rFonts w:ascii="Arial" w:hAnsi="Arial"/>
+                <w:sz w:val="18"/>
+              </w:rPr>
+              <w:t xml:space="preserve"/>
+            </w:r>
+          </w:p>
+        </w:tc>
+      </w:tr>
+      <w:tr>
+        <w:tc>
+          <w:tcPr>
+            <w:tcW w:w="900" w:type="dxa"/>
+            <w:vAlign w:val="center"/>
+          </w:tcPr>
+          <w:p>
+            <w:pPr>
+              <w:jc w:val="center"/>
+              <w:spacing w:after="20" w:before="20" w:line="240" w:lineRule="auto"/>
+            </w:pPr>
+            <w:r>
+              <w:rPr>
+                <w:rFonts w:ascii="Arial" w:hAnsi="Arial"/>
+                <w:sz w:val="18"/>
+              </w:rPr>
+              <w:t xml:space="preserve">80</w:t>
+            </w:r>
+          </w:p>
+        </w:tc>
+        <w:tc>
+          <w:tcPr>
+            <w:tcW w:w="1700" w:type="dxa"/>
+            <w:vAlign w:val="center"/>
+          </w:tcPr>
+          <w:p>
+            <w:pPr>
+              <w:jc w:val="center"/>
+              <w:spacing w:after="20" w:before="20" w:line="240" w:lineRule="auto"/>
+            </w:pPr>
+            <w:r>
+              <w:rPr>
+                <w:rFonts w:ascii="Arial" w:hAnsi="Arial"/>
+                <w:sz w:val="18"/>
+              </w:rPr>
+              <w:t xml:space="preserve">AL CFO PM</w:t>
+            </w:r>
+          </w:p>
+        </w:tc>
+        <w:tc>
+          <w:tcPr>
+            <w:tcW w:w="4500" w:type="dxa"/>
+            <w:vAlign w:val="center"/>
+          </w:tcPr>
+          <w:p>
+            <w:pPr>
+              <w:jc w:val="left"/>
+              <w:spacing w:after="20" w:before="20" w:line="240" w:lineRule="auto"/>
+            </w:pPr>
+            <w:r>
+              <w:rPr>
+                <w:rFonts w:ascii="Arial" w:hAnsi="Arial"/>
+                <w:sz w:val="18"/>
+              </w:rPr>
+              <w:t xml:space="preserve">LUIZ OLIVEIRA</w:t>
+            </w:r>
+          </w:p>
+        </w:tc>
+        <w:tc>
+          <w:tcPr>
+            <w:tcW w:w="2500" w:type="dxa"/>
+            <w:vAlign w:val="center"/>
+          </w:tcPr>
+          <w:p>
+            <w:pPr>
+              <w:jc w:val="left"/>
+              <w:spacing w:after="20" w:before="20" w:line="240" w:lineRule="auto"/>
+            </w:pPr>
+            <w:r>
+              <w:rPr>
+                <w:rFonts w:ascii="Arial" w:hAnsi="Arial"/>
+                <w:sz w:val="18"/>
+              </w:rPr>
+              <w:t xml:space="preserve"/>
+            </w:r>
+          </w:p>
+        </w:tc>
+      </w:tr>
+      <w:tr>
+        <w:tc>
+          <w:tcPr>
+            <w:tcW w:w="900" w:type="dxa"/>
+            <w:vAlign w:val="center"/>
+          </w:tcPr>
+          <w:p>
+            <w:pPr>
+              <w:jc w:val="center"/>
+              <w:spacing w:after="20" w:before="20" w:line="240" w:lineRule="auto"/>
+            </w:pPr>
+            <w:r>
+              <w:rPr>
+                <w:rFonts w:ascii="Arial" w:hAnsi="Arial"/>
+                <w:sz w:val="18"/>
+              </w:rPr>
+              <w:t xml:space="preserve">111</w:t>
+            </w:r>
+          </w:p>
+        </w:tc>
+        <w:tc>
+          <w:tcPr>
+            <w:tcW w:w="1700" w:type="dxa"/>
+            <w:vAlign w:val="center"/>
+          </w:tcPr>
+          <w:p>
+            <w:pPr>
+              <w:jc w:val="center"/>
+              <w:spacing w:after="20" w:before="20" w:line="240" w:lineRule="auto"/>
+            </w:pPr>
+            <w:r>
+              <w:rPr>
+                <w:rFonts w:ascii="Arial" w:hAnsi="Arial"/>
+                <w:sz w:val="18"/>
+              </w:rPr>
+              <w:t xml:space="preserve">AL CFO PM</w:t>
+            </w:r>
+          </w:p>
+        </w:tc>
+        <w:tc>
+          <w:tcPr>
+            <w:tcW w:w="4500" w:type="dxa"/>
+            <w:vAlign w:val="center"/>
+          </w:tcPr>
+          <w:p>
+            <w:pPr>
+              <w:jc w:val="left"/>
+              <w:spacing w:after="20" w:before="20" w:line="240" w:lineRule="auto"/>
+            </w:pPr>
+            <w:r>
+              <w:rPr>
+                <w:rFonts w:ascii="Arial" w:hAnsi="Arial"/>
+                <w:sz w:val="18"/>
+              </w:rPr>
+              <w:t xml:space="preserve">ANDRÉ MARINHO</w:t>
+            </w:r>
+          </w:p>
+        </w:tc>
+        <w:tc>
+          <w:tcPr>
+            <w:tcW w:w="2500" w:type="dxa"/>
+            <w:vAlign w:val="center"/>
+          </w:tcPr>
+          <w:p>
+            <w:pPr>
+              <w:jc w:val="left"/>
+              <w:spacing w:after="20" w:before="20" w:line="240" w:lineRule="auto"/>
+            </w:pPr>
+            <w:r>
+              <w:rPr>
+                <w:rFonts w:ascii="Arial" w:hAnsi="Arial"/>
+                <w:sz w:val="18"/>
+              </w:rPr>
+              <w:t xml:space="preserve"/>
+            </w:r>
+          </w:p>
+        </w:tc>
+      </w:tr>
+      <w:tr>
+        <w:tc>
+          <w:tcPr>
+            <w:tcW w:w="900" w:type="dxa"/>
+            <w:vAlign w:val="center"/>
+          </w:tcPr>
+          <w:p>
+            <w:pPr>
+              <w:jc w:val="center"/>
+              <w:spacing w:after="20" w:before="20" w:line="240" w:lineRule="auto"/>
+            </w:pPr>
+            <w:r>
+              <w:rPr>
+                <w:rFonts w:ascii="Arial" w:hAnsi="Arial"/>
+                <w:sz w:val="18"/>
+              </w:rPr>
               <w:t xml:space="preserve">143</w:t>
             </w:r>
           </w:p>
@@ -563,6 +1733,162 @@
                 <w:rFonts w:ascii="Arial" w:hAnsi="Arial"/>
                 <w:sz w:val="18"/>
               </w:rPr>
+              <w:t xml:space="preserve">159</w:t>
+            </w:r>
+          </w:p>
+        </w:tc>
+        <w:tc>
+          <w:tcPr>
+            <w:tcW w:w="1700" w:type="dxa"/>
+            <w:vAlign w:val="center"/>
+          </w:tcPr>
+          <w:p>
+            <w:pPr>
+              <w:jc w:val="center"/>
+              <w:spacing w:after="20" w:before="20" w:line="240" w:lineRule="auto"/>
+            </w:pPr>
+            <w:r>
+              <w:rPr>
+                <w:rFonts w:ascii="Arial" w:hAnsi="Arial"/>
+                <w:sz w:val="18"/>
+              </w:rPr>
+              <w:t xml:space="preserve">AL CFO PM</w:t>
+            </w:r>
+          </w:p>
+        </w:tc>
+        <w:tc>
+          <w:tcPr>
+            <w:tcW w:w="4500" w:type="dxa"/>
+            <w:vAlign w:val="center"/>
+          </w:tcPr>
+          <w:p>
+            <w:pPr>
+              <w:jc w:val="left"/>
+              <w:spacing w:after="20" w:before="20" w:line="240" w:lineRule="auto"/>
+            </w:pPr>
+            <w:r>
+              <w:rPr>
+                <w:rFonts w:ascii="Arial" w:hAnsi="Arial"/>
+                <w:sz w:val="18"/>
+              </w:rPr>
+              <w:t xml:space="preserve">HIGOR LIMA</w:t>
+            </w:r>
+          </w:p>
+        </w:tc>
+        <w:tc>
+          <w:tcPr>
+            <w:tcW w:w="2500" w:type="dxa"/>
+            <w:vAlign w:val="center"/>
+          </w:tcPr>
+          <w:p>
+            <w:pPr>
+              <w:jc w:val="left"/>
+              <w:spacing w:after="20" w:before="20" w:line="240" w:lineRule="auto"/>
+            </w:pPr>
+            <w:r>
+              <w:rPr>
+                <w:rFonts w:ascii="Arial" w:hAnsi="Arial"/>
+                <w:sz w:val="18"/>
+              </w:rPr>
+              <w:t xml:space="preserve"/>
+            </w:r>
+          </w:p>
+        </w:tc>
+      </w:tr>
+      <w:tr>
+        <w:tc>
+          <w:tcPr>
+            <w:tcW w:w="900" w:type="dxa"/>
+            <w:vAlign w:val="center"/>
+          </w:tcPr>
+          <w:p>
+            <w:pPr>
+              <w:jc w:val="center"/>
+              <w:spacing w:after="20" w:before="20" w:line="240" w:lineRule="auto"/>
+            </w:pPr>
+            <w:r>
+              <w:rPr>
+                <w:rFonts w:ascii="Arial" w:hAnsi="Arial"/>
+                <w:sz w:val="18"/>
+              </w:rPr>
+              <w:t xml:space="preserve">184</w:t>
+            </w:r>
+          </w:p>
+        </w:tc>
+        <w:tc>
+          <w:tcPr>
+            <w:tcW w:w="1700" w:type="dxa"/>
+            <w:vAlign w:val="center"/>
+          </w:tcPr>
+          <w:p>
+            <w:pPr>
+              <w:jc w:val="center"/>
+              <w:spacing w:after="20" w:before="20" w:line="240" w:lineRule="auto"/>
+            </w:pPr>
+            <w:r>
+              <w:rPr>
+                <w:rFonts w:ascii="Arial" w:hAnsi="Arial"/>
+                <w:sz w:val="18"/>
+              </w:rPr>
+              <w:t xml:space="preserve">AL CFO PM</w:t>
+            </w:r>
+          </w:p>
+        </w:tc>
+        <w:tc>
+          <w:tcPr>
+            <w:tcW w:w="4500" w:type="dxa"/>
+            <w:vAlign w:val="center"/>
+          </w:tcPr>
+          <w:p>
+            <w:pPr>
+              <w:jc w:val="left"/>
+              <w:spacing w:after="20" w:before="20" w:line="240" w:lineRule="auto"/>
+            </w:pPr>
+            <w:r>
+              <w:rPr>
+                <w:rFonts w:ascii="Arial" w:hAnsi="Arial"/>
+                <w:sz w:val="18"/>
+              </w:rPr>
+              <w:t xml:space="preserve">PAULO AZEVÊDO</w:t>
+            </w:r>
+          </w:p>
+        </w:tc>
+        <w:tc>
+          <w:tcPr>
+            <w:tcW w:w="2500" w:type="dxa"/>
+            <w:vAlign w:val="center"/>
+          </w:tcPr>
+          <w:p>
+            <w:pPr>
+              <w:jc w:val="left"/>
+              <w:spacing w:after="20" w:before="20" w:line="240" w:lineRule="auto"/>
+            </w:pPr>
+            <w:r>
+              <w:rPr>
+                <w:rFonts w:ascii="Arial" w:hAnsi="Arial"/>
+                <w:sz w:val="18"/>
+              </w:rPr>
+              <w:t xml:space="preserve"/>
+            </w:r>
+          </w:p>
+        </w:tc>
+      </w:tr>
+      <w:tr>
+        <w:tc>
+          <w:tcPr>
+            <w:tcW w:w="900" w:type="dxa"/>
+            <w:vAlign w:val="center"/>
+          </w:tcPr>
+          <w:p>
+            <w:pPr>
+              <w:jc w:val="center"/>
+              <w:spacing w:after="20" w:before="20" w:line="240" w:lineRule="auto"/>
+            </w:pPr>
+            <w:r>
+              <w:rPr>
+                <w:rFonts w:ascii="Arial" w:hAnsi="Arial"/>
+                <w:sz w:val="18"/>
+              </w:rPr>
               <w:t xml:space="preserve">191</w:t>
             </w:r>
           </w:p>
@@ -602,6 +1928,240 @@
                 <w:sz w:val="18"/>
               </w:rPr>
               <w:t xml:space="preserve">GOMES NASCIMENTO</w:t>
+            </w:r>
+          </w:p>
+        </w:tc>
+        <w:tc>
+          <w:tcPr>
+            <w:tcW w:w="2500" w:type="dxa"/>
+            <w:vAlign w:val="center"/>
+          </w:tcPr>
+          <w:p>
+            <w:pPr>
+              <w:jc w:val="left"/>
+              <w:spacing w:after="20" w:before="20" w:line="240" w:lineRule="auto"/>
+            </w:pPr>
+            <w:r>
+              <w:rPr>
+                <w:rFonts w:ascii="Arial" w:hAnsi="Arial"/>
+                <w:sz w:val="18"/>
+              </w:rPr>
+              <w:t xml:space="preserve"/>
+            </w:r>
+          </w:p>
+        </w:tc>
+      </w:tr>
+      <w:tr>
+        <w:tc>
+          <w:tcPr>
+            <w:tcW w:w="900" w:type="dxa"/>
+            <w:vAlign w:val="center"/>
+          </w:tcPr>
+          <w:p>
+            <w:pPr>
+              <w:jc w:val="center"/>
+              <w:spacing w:after="20" w:before="20" w:line="240" w:lineRule="auto"/>
+            </w:pPr>
+            <w:r>
+              <w:rPr>
+                <w:rFonts w:ascii="Arial" w:hAnsi="Arial"/>
+                <w:sz w:val="18"/>
+              </w:rPr>
+              <w:t xml:space="preserve">196</w:t>
+            </w:r>
+          </w:p>
+        </w:tc>
+        <w:tc>
+          <w:tcPr>
+            <w:tcW w:w="1700" w:type="dxa"/>
+            <w:vAlign w:val="center"/>
+          </w:tcPr>
+          <w:p>
+            <w:pPr>
+              <w:jc w:val="center"/>
+              <w:spacing w:after="20" w:before="20" w:line="240" w:lineRule="auto"/>
+            </w:pPr>
+            <w:r>
+              <w:rPr>
+                <w:rFonts w:ascii="Arial" w:hAnsi="Arial"/>
+                <w:sz w:val="18"/>
+              </w:rPr>
+              <w:t xml:space="preserve">AL CFO PM</w:t>
+            </w:r>
+          </w:p>
+        </w:tc>
+        <w:tc>
+          <w:tcPr>
+            <w:tcW w:w="4500" w:type="dxa"/>
+            <w:vAlign w:val="center"/>
+          </w:tcPr>
+          <w:p>
+            <w:pPr>
+              <w:jc w:val="left"/>
+              <w:spacing w:after="20" w:before="20" w:line="240" w:lineRule="auto"/>
+            </w:pPr>
+            <w:r>
+              <w:rPr>
+                <w:rFonts w:ascii="Arial" w:hAnsi="Arial"/>
+                <w:sz w:val="18"/>
+              </w:rPr>
+              <w:t xml:space="preserve">EDUARDA RODRIGUES</w:t>
+            </w:r>
+          </w:p>
+        </w:tc>
+        <w:tc>
+          <w:tcPr>
+            <w:tcW w:w="2500" w:type="dxa"/>
+            <w:vAlign w:val="center"/>
+          </w:tcPr>
+          <w:p>
+            <w:pPr>
+              <w:jc w:val="left"/>
+              <w:spacing w:after="20" w:before="20" w:line="240" w:lineRule="auto"/>
+            </w:pPr>
+            <w:r>
+              <w:rPr>
+                <w:rFonts w:ascii="Arial" w:hAnsi="Arial"/>
+                <w:sz w:val="18"/>
+              </w:rPr>
+              <w:t xml:space="preserve"/>
+            </w:r>
+          </w:p>
+        </w:tc>
+      </w:tr>
+      <w:tr>
+        <w:tc>
+          <w:tcPr>
+            <w:tcW w:w="900" w:type="dxa"/>
+            <w:vAlign w:val="center"/>
+          </w:tcPr>
+          <w:p>
+            <w:pPr>
+              <w:jc w:val="center"/>
+              <w:spacing w:after="20" w:before="20" w:line="240" w:lineRule="auto"/>
+            </w:pPr>
+            <w:r>
+              <w:rPr>
+                <w:rFonts w:ascii="Arial" w:hAnsi="Arial"/>
+                <w:sz w:val="18"/>
+              </w:rPr>
+              <w:t xml:space="preserve">197</w:t>
+            </w:r>
+          </w:p>
+        </w:tc>
+        <w:tc>
+          <w:tcPr>
+            <w:tcW w:w="1700" w:type="dxa"/>
+            <w:vAlign w:val="center"/>
+          </w:tcPr>
+          <w:p>
+            <w:pPr>
+              <w:jc w:val="center"/>
+              <w:spacing w:after="20" w:before="20" w:line="240" w:lineRule="auto"/>
+            </w:pPr>
+            <w:r>
+              <w:rPr>
+                <w:rFonts w:ascii="Arial" w:hAnsi="Arial"/>
+                <w:sz w:val="18"/>
+              </w:rPr>
+              <w:t xml:space="preserve">AL CFO PM</w:t>
+            </w:r>
+          </w:p>
+        </w:tc>
+        <w:tc>
+          <w:tcPr>
+            <w:tcW w:w="4500" w:type="dxa"/>
+            <w:vAlign w:val="center"/>
+          </w:tcPr>
+          <w:p>
+            <w:pPr>
+              <w:jc w:val="left"/>
+              <w:spacing w:after="20" w:before="20" w:line="240" w:lineRule="auto"/>
+            </w:pPr>
+            <w:r>
+              <w:rPr>
+                <w:rFonts w:ascii="Arial" w:hAnsi="Arial"/>
+                <w:sz w:val="18"/>
+              </w:rPr>
+              <w:t xml:space="preserve">ABREU</w:t>
+            </w:r>
+          </w:p>
+        </w:tc>
+        <w:tc>
+          <w:tcPr>
+            <w:tcW w:w="2500" w:type="dxa"/>
+            <w:vAlign w:val="center"/>
+          </w:tcPr>
+          <w:p>
+            <w:pPr>
+              <w:jc w:val="left"/>
+              <w:spacing w:after="20" w:before="20" w:line="240" w:lineRule="auto"/>
+            </w:pPr>
+            <w:r>
+              <w:rPr>
+                <w:rFonts w:ascii="Arial" w:hAnsi="Arial"/>
+                <w:sz w:val="18"/>
+              </w:rPr>
+              <w:t xml:space="preserve"/>
+            </w:r>
+          </w:p>
+        </w:tc>
+      </w:tr>
+      <w:tr>
+        <w:tc>
+          <w:tcPr>
+            <w:tcW w:w="900" w:type="dxa"/>
+            <w:vAlign w:val="center"/>
+          </w:tcPr>
+          <w:p>
+            <w:pPr>
+              <w:jc w:val="center"/>
+              <w:spacing w:after="20" w:before="20" w:line="240" w:lineRule="auto"/>
+            </w:pPr>
+            <w:r>
+              <w:rPr>
+                <w:rFonts w:ascii="Arial" w:hAnsi="Arial"/>
+                <w:sz w:val="18"/>
+              </w:rPr>
+              <w:t xml:space="preserve">199</w:t>
+            </w:r>
+          </w:p>
+        </w:tc>
+        <w:tc>
+          <w:tcPr>
+            <w:tcW w:w="1700" w:type="dxa"/>
+            <w:vAlign w:val="center"/>
+          </w:tcPr>
+          <w:p>
+            <w:pPr>
+              <w:jc w:val="center"/>
+              <w:spacing w:after="20" w:before="20" w:line="240" w:lineRule="auto"/>
+            </w:pPr>
+            <w:r>
+              <w:rPr>
+                <w:rFonts w:ascii="Arial" w:hAnsi="Arial"/>
+                <w:sz w:val="18"/>
+              </w:rPr>
+              <w:t xml:space="preserve">AL CFO PM</w:t>
+            </w:r>
+          </w:p>
+        </w:tc>
+        <w:tc>
+          <w:tcPr>
+            <w:tcW w:w="4500" w:type="dxa"/>
+            <w:vAlign w:val="center"/>
+          </w:tcPr>
+          <w:p>
+            <w:pPr>
+              <w:jc w:val="left"/>
+              <w:spacing w:after="20" w:before="20" w:line="240" w:lineRule="auto"/>
+            </w:pPr>
+            <w:r>
+              <w:rPr>
+                <w:rFonts w:ascii="Arial" w:hAnsi="Arial"/>
+                <w:sz w:val="18"/>
+              </w:rPr>
+              <w:t xml:space="preserve">BARROS</w:t>
             </w:r>
           </w:p>
         </w:tc>
@@ -643,7 +2203,7 @@
                 <w:sz w:val="18"/>
                 <w:b/>
               </w:rPr>
-              <w:t xml:space="preserve">TOTAL PLANTÃO: 5</w:t>
+              <w:t xml:space="preserve">TOTAL PLANTÃO: 25</w:t>
             </w:r>
           </w:p>
         </w:tc>

</xml_diff>